<commit_message>
Update daily-run working files
Co-Authored-By: Claude Opus 5.5 <noreply@anthropic.com>
Claude-Session: https://claude.ai/code/session_01VpCXqDFSAKkK8y6mKL2HCw
</commit_message>
<xml_diff>
--- a/applications/robinson-and-casey-pllc-director-of-marketing-strategy/build/Joshua_Chappell_CoverLetter_RobinsonAndCasey.docx
+++ b/applications/robinson-and-casey-pllc-director-of-marketing-strategy/build/Joshua_Chappell_CoverLetter_RobinsonAndCasey.docx
@@ -27,7 +27,7 @@
         </w:rPr>
         <w:t xml:space="preserve">Mesa, AZ  •  480-586-7959  •  </w:t>
       </w:r>
-      <w:hyperlink w:history="1" r:id="rIdmo9yusdxr3j9z9wyzzm76">
+      <w:hyperlink w:history="1" r:id="rIdvlby85uhhdynudrhiznl4">
         <w:r>
           <w:rPr>
             <w:rFonts w:ascii="Calibri" w:cs="Calibri" w:eastAsia="Calibri" w:hAnsi="Calibri"/>
@@ -47,7 +47,7 @@
         </w:rPr>
         <w:t xml:space="preserve">  •  </w:t>
       </w:r>
-      <w:hyperlink w:history="1" r:id="rIdk5pvqxim_cr4zlpikxxcs">
+      <w:hyperlink w:history="1" r:id="rIdnftnckd9ax5oyjlmq60xe">
         <w:r>
           <w:rPr>
             <w:rFonts w:ascii="Calibri" w:cs="Calibri" w:eastAsia="Calibri" w:hAnsi="Calibri"/>
@@ -67,7 +67,7 @@
         </w:rPr>
         <w:t xml:space="preserve">  •  </w:t>
       </w:r>
-      <w:hyperlink w:history="1" r:id="rIdhtnmalz0hcklhyocevw27">
+      <w:hyperlink w:history="1" r:id="rIdxulhyxy4-rawp0vy0el12">
         <w:r>
           <w:rPr>
             <w:rFonts w:ascii="Calibri" w:cs="Calibri" w:eastAsia="Calibri" w:hAnsi="Calibri"/>
@@ -87,7 +87,7 @@
         </w:rPr>
         <w:t xml:space="preserve">  •  </w:t>
       </w:r>
-      <w:hyperlink w:history="1" r:id="rIdh4_0pi8ipyj6s8w8nni4d">
+      <w:hyperlink w:history="1" r:id="rId5wpjayoo4_afp0mffny6p">
         <w:r>
           <w:rPr>
             <w:rFonts w:ascii="Calibri" w:cs="Calibri" w:eastAsia="Calibri" w:hAnsi="Calibri"/>
@@ -152,7 +152,7 @@
           <w:sz w:val="22"/>
           <w:szCs w:val="22"/>
         </w:rPr>
-        <w:t xml:space="preserve">Your families reach out in the hardest moments of their lives, so the message has to be clear and kind on every channel. I have built enrollment content for families at Charter One and produced content for healthcare professionals at Grand Canyon Education. I shoot, edit, and design the creative myself, which covers the videography, photography, and graphic design on your preferred list. I have also been the vendor since 2019, and I delivered 98% of projects on time and 92% within budget. I know what good vendor work looks like, and I will hold your website, SEO, PPC, and creative partners to it.</w:t>
+        <w:t xml:space="preserve">Your families reach out in the hardest moments of their lives, so the message has to be clear and kind on every channel. I have built enrollment content for families at Charter One and produced content for healthcare professionals at Grand Canyon Education. I shoot, edit, and design the creative myself, which covers the videography, photography, and graphic design on your preferred list. I have also run a creative vendor business since 2019, where I delivered 98% of projects on time and 92% within budget. I know what good vendor work looks like, and I will hold your website, SEO, PPC, and creative partners to it.</w:t>
       </w:r>
     </w:p>
     <w:p>

</xml_diff>